<commit_message>
Correct the syllabus mapping doc's own stated audience
Its cover page said "Prepared for: Curriculum Development Centre
(CDC)" - wrong. It's the author's internal planning and reference
document, not something addressed to CDC; the CDC submission
package is what it exists to help prepare, not this document
itself. Only the facilitator's guide and pilot plan are meant for
other people (teachers, whoever runs the pilot).

Bumped to v0.5, updated the cover table and version history, and
regenerated the PDF.

Co-Authored-By: Claude Sonnet 5 <noreply@anthropic.com>
Claude-Session: https://claude.ai/code/session_01S1ZS8fjUnTRcrXfFvHxdTZ
</commit_message>
<xml_diff>
--- a/pathway-orientation/docs/syllabus-mapping.docx
+++ b/pathway-orientation/docs/syllabus-mapping.docx
@@ -234,7 +234,7 @@
                 <w:sz w:val="18"/>
                 <w:szCs w:val="18"/>
               </w:rPr>
-              <w:t xml:space="preserve">Curriculum Development Centre (CDC), Ministry of Education, Zambia — supporting documentation for reader approval submission</w:t>
+              <w:t xml:space="preserve">Internal use — the author's own planning and reference document while preparing the CDC submission package</w:t>
             </w:r>
           </w:p>
         </w:tc>
@@ -423,7 +423,7 @@
                 <w:sz w:val="18"/>
                 <w:szCs w:val="18"/>
               </w:rPr>
-              <w:t xml:space="preserve">0.4</w:t>
+              <w:t xml:space="preserve">0.5</w:t>
             </w:r>
           </w:p>
         </w:tc>
@@ -486,7 +486,7 @@
                 <w:sz w:val="18"/>
                 <w:szCs w:val="18"/>
               </w:rPr>
-              <w:t xml:space="preserve">14 September 2026</w:t>
+              <w:t xml:space="preserve">15 September 2026</w:t>
             </w:r>
           </w:p>
         </w:tc>
@@ -545,7 +545,7 @@
           <w:sz w:val="21"/>
           <w:szCs w:val="21"/>
         </w:rPr>
-        <w:t xml:space="preserve">Version 0.2 replaced the placeholder competency-domain framework used in version 0.1 with the actual structure set out in the 2023 Zambia Education Curriculum Framework (Republic of Zambia, Ministry of Education, Curriculum Development Centre). Version 0.3 recorded that the Social-domain activity and the three data-accuracy fixes recommended in v0.2 had both been completed. Version 0.4 adds docs/pilot-plan.docx — a protocol and feedback toolkit for piloting the workbook in a real school, still outstanding (Section 8).</w:t>
+        <w:t xml:space="preserve">Version 0.2 replaced the placeholder competency-domain framework used in version 0.1 with the actual structure set out in the 2023 Zambia Education Curriculum Framework (Republic of Zambia, Ministry of Education, Curriculum Development Centre). Version 0.3 recorded that the Social-domain activity and the three data-accuracy fixes recommended in v0.2 had both been completed. Version 0.4 added docs/pilot-plan.docx — a protocol and feedback toolkit for piloting the workbook in a real school, still outstanding (Section 8). Version 0.5 corrects this document's own audience: it is the author's internal planning and reference document, not a document addressed to CDC — the CDC submission package is what this document exists to help prepare, not this document itself.</w:t>
       </w:r>
     </w:p>
     <w:p>
@@ -6282,7 +6282,7 @@
         <w:sz w:val="16"/>
         <w:szCs w:val="16"/>
       </w:rPr>
-      <w:t xml:space="preserve">Pathway Orientation — Syllabus Mapping (DRAFT v0.4)</w:t>
+      <w:t xml:space="preserve">Pathway Orientation — Syllabus Mapping (DRAFT v0.5)</w:t>
     </w:r>
   </w:p>
 </w:hdr>

</xml_diff>